<commit_message>
Resolve portfolio audit findings and verify artifacts
</commit_message>
<xml_diff>
--- a/docs/academic-case-study-fr.docx
+++ b/docs/academic-case-study-fr.docx
@@ -1,6 +1,6 @@
 
 <file path=word/document.xml><?xml version="1.0" encoding="utf-8"?>
-<w:document xmlns:wpc="http://schemas.microsoft.com/office/word/2010/wordprocessingCanvas" xmlns:cx="http://schemas.microsoft.com/office/drawing/2014/chartex" xmlns:mc="http://schemas.openxmlformats.org/markup-compatibility/2006" xmlns:o="urn:schemas-microsoft-com:office:office" xmlns:r="http://schemas.openxmlformats.org/officeDocument/2006/relationships" xmlns:m="http://schemas.openxmlformats.org/officeDocument/2006/math" xmlns:v="urn:schemas-microsoft-com:vml" xmlns:wp14="http://schemas.microsoft.com/office/word/2010/wordprocessingDrawing" xmlns:wp="http://schemas.openxmlformats.org/drawingml/2006/wordprocessingDrawing" xmlns:w10="urn:schemas-microsoft-com:office:word" xmlns:w="http://schemas.openxmlformats.org/wordprocessingml/2006/main" xmlns:w14="http://schemas.microsoft.com/office/word/2010/wordml" xmlns:w15="http://schemas.microsoft.com/office/word/2012/wordml" xmlns:w16se="http://schemas.microsoft.com/office/word/2015/wordml/symex" xmlns:wpg="http://schemas.microsoft.com/office/word/2010/wordprocessingGroup" xmlns:wpi="http://schemas.microsoft.com/office/word/2010/wordprocessingInk" xmlns:wne="http://schemas.microsoft.com/office/word/2006/wordml" xmlns:wps="http://schemas.microsoft.com/office/word/2010/wordprocessingShape" mc:Ignorable="w14 w15 w16se wp14">
+<w:document xmlns:wpc="http://schemas.microsoft.com/office/word/2010/wordprocessingCanvas" xmlns:cx="http://schemas.microsoft.com/office/drawing/2014/chartex" xmlns:cx1="http://schemas.microsoft.com/office/drawing/2015/9/8/chartex" xmlns:cx2="http://schemas.microsoft.com/office/drawing/2015/10/21/chartex" xmlns:cx3="http://schemas.microsoft.com/office/drawing/2016/5/9/chartex" xmlns:cx4="http://schemas.microsoft.com/office/drawing/2016/5/10/chartex" xmlns:cx5="http://schemas.microsoft.com/office/drawing/2016/5/11/chartex" xmlns:cx6="http://schemas.microsoft.com/office/drawing/2016/5/12/chartex" xmlns:cx7="http://schemas.microsoft.com/office/drawing/2016/5/13/chartex" xmlns:cx8="http://schemas.microsoft.com/office/drawing/2016/5/14/chartex" xmlns:mc="http://schemas.openxmlformats.org/markup-compatibility/2006" xmlns:aink="http://schemas.microsoft.com/office/drawing/2016/ink" xmlns:am3d="http://schemas.microsoft.com/office/drawing/2017/model3d" xmlns:o="urn:schemas-microsoft-com:office:office" xmlns:oel="http://schemas.microsoft.com/office/2019/extlst" xmlns:r="http://schemas.openxmlformats.org/officeDocument/2006/relationships" xmlns:m="http://schemas.openxmlformats.org/officeDocument/2006/math" xmlns:v="urn:schemas-microsoft-com:vml" xmlns:wp14="http://schemas.microsoft.com/office/word/2010/wordprocessingDrawing" xmlns:wp="http://schemas.openxmlformats.org/drawingml/2006/wordprocessingDrawing" xmlns:w10="urn:schemas-microsoft-com:office:word" xmlns:w="http://schemas.openxmlformats.org/wordprocessingml/2006/main" xmlns:w14="http://schemas.microsoft.com/office/word/2010/wordml" xmlns:w15="http://schemas.microsoft.com/office/word/2012/wordml" xmlns:w16cex="http://schemas.microsoft.com/office/word/2018/wordml/cex" xmlns:w16cid="http://schemas.microsoft.com/office/word/2016/wordml/cid" xmlns:w16="http://schemas.microsoft.com/office/word/2018/wordml" xmlns:w16du="http://schemas.microsoft.com/office/word/2023/wordml/word16du" xmlns:w16sdtdh="http://schemas.microsoft.com/office/word/2020/wordml/sdtdatahash" xmlns:w16sdtfl="http://schemas.microsoft.com/office/word/2024/wordml/sdtformatlock" xmlns:w16se="http://schemas.microsoft.com/office/word/2015/wordml/symex" xmlns:wpg="http://schemas.microsoft.com/office/word/2010/wordprocessingGroup" xmlns:wpi="http://schemas.microsoft.com/office/word/2010/wordprocessingInk" xmlns:wne="http://schemas.microsoft.com/office/word/2006/wordml" xmlns:wps="http://schemas.microsoft.com/office/word/2010/wordprocessingShape" mc:Ignorable="w14 w15 w16se w16cid w16 w16cex w16sdtdh w16sdtfl w16du wp14">
   <w:body>
     <w:p>
       <w:pPr>
@@ -13,21 +13,7 @@
         <w:rPr>
           <w:lang w:val="fr-FR"/>
         </w:rPr>
-        <w:t xml:space="preserve">Étude de cas – Segmentation réseau avec </w:t>
-      </w:r>
-      <w:proofErr w:type="spellStart"/>
-      <w:r>
-        <w:rPr>
-          <w:lang w:val="fr-FR"/>
-        </w:rPr>
-        <w:t>VLANs</w:t>
-      </w:r>
-      <w:proofErr w:type="spellEnd"/>
-      <w:r>
-        <w:rPr>
-          <w:lang w:val="fr-FR"/>
-        </w:rPr>
-        <w:t xml:space="preserve"> dans une PME</w:t>
+        <w:t>Étude de cas – Segmentation réseau avec VLANs dans une PME</w:t>
       </w:r>
     </w:p>
     <w:p>
@@ -88,13 +74,7 @@
           <w:lang w:val="fr-FR"/>
         </w:rPr>
         <w:br/>
-        <w:t xml:space="preserve">L'entreprise </w:t>
-      </w:r>
-      <w:r>
-        <w:rPr>
-          <w:lang w:val="fr-FR"/>
-        </w:rPr>
-        <w:t>dispose de 10 postes pour le service RH, 8 pour la comptabilité, 6 pour le service informatique, et 6 pour la direction. Actuellement, tous les ordinateurs sont connectés sur un même réseau local sans aucune segmentation.</w:t>
+        <w:t>L'entreprise dispose de 10 postes pour le service RH, 8 pour la comptabilité, 6 pour le service informatique, et 6 pour la direction. Actuellement, tous les ordinateurs sont connectés sur un même réseau local sans aucune segmentation.</w:t>
       </w:r>
     </w:p>
     <w:p>
@@ -121,13 +101,7 @@
         <w:rPr>
           <w:lang w:val="fr-FR"/>
         </w:rPr>
-        <w:t>- Trop de diffusi</w:t>
-      </w:r>
-      <w:r>
-        <w:rPr>
-          <w:lang w:val="fr-FR"/>
-        </w:rPr>
-        <w:t>on réseau (broadcast).</w:t>
+        <w:t>- Trop de diffusion réseau (broadcast).</w:t>
       </w:r>
       <w:r>
         <w:rPr>
@@ -162,13 +136,7 @@
         <w:rPr>
           <w:lang w:val="fr-FR"/>
         </w:rPr>
-        <w:t>3. O</w:t>
-      </w:r>
-      <w:r>
-        <w:rPr>
-          <w:lang w:val="fr-FR"/>
-        </w:rPr>
-        <w:t>bjectif du projet</w:t>
+        <w:t>3. Objectif du projet</w:t>
       </w:r>
     </w:p>
     <w:p>
@@ -181,21 +149,7 @@
         <w:rPr>
           <w:lang w:val="fr-FR"/>
         </w:rPr>
-        <w:t xml:space="preserve">Mettre en place une segmentation logique du réseau via des </w:t>
-      </w:r>
-      <w:proofErr w:type="spellStart"/>
-      <w:r>
-        <w:rPr>
-          <w:lang w:val="fr-FR"/>
-        </w:rPr>
-        <w:t>VLANs</w:t>
-      </w:r>
-      <w:proofErr w:type="spellEnd"/>
-      <w:r>
-        <w:rPr>
-          <w:lang w:val="fr-FR"/>
-        </w:rPr>
-        <w:t xml:space="preserve"> pour :</w:t>
+        <w:t>Mettre en place une segmentation logique du réseau via des VLANs pour :</w:t>
       </w:r>
       <w:r>
         <w:rPr>
@@ -223,16 +177,8 @@
           <w:lang w:val="fr-FR"/>
         </w:rPr>
         <w:br/>
-        <w:t>- Préparer l’infrastructure à l’évolution future (Wi-Fi, télé</w:t>
+        <w:t>- Préparer l’infrastructure à l’évolution future (Wi-Fi, téléphonie IP).</w:t>
       </w:r>
-      <w:r>
-        <w:rPr>
-          <w:lang w:val="fr-FR"/>
-        </w:rPr>
-        <w:t>phonie IP).</w:t>
-      </w:r>
-      <w:bookmarkStart w:id="0" w:name="_GoBack"/>
-      <w:bookmarkEnd w:id="0"/>
     </w:p>
     <w:sectPr>
       <w:pgSz w:w="12240" w:h="15840"/>
@@ -245,7 +191,7 @@
 </file>
 
 <file path=word/numbering.xml><?xml version="1.0" encoding="utf-8"?>
-<w:numbering xmlns:wpc="http://schemas.microsoft.com/office/word/2010/wordprocessingCanvas" xmlns:cx="http://schemas.microsoft.com/office/drawing/2014/chartex" xmlns:mc="http://schemas.openxmlformats.org/markup-compatibility/2006" xmlns:o="urn:schemas-microsoft-com:office:office" xmlns:r="http://schemas.openxmlformats.org/officeDocument/2006/relationships" xmlns:m="http://schemas.openxmlformats.org/officeDocument/2006/math" xmlns:v="urn:schemas-microsoft-com:vml" xmlns:wp14="http://schemas.microsoft.com/office/word/2010/wordprocessingDrawing" xmlns:wp="http://schemas.openxmlformats.org/drawingml/2006/wordprocessingDrawing" xmlns:w10="urn:schemas-microsoft-com:office:word" xmlns:w="http://schemas.openxmlformats.org/wordprocessingml/2006/main" xmlns:w14="http://schemas.microsoft.com/office/word/2010/wordml" xmlns:w15="http://schemas.microsoft.com/office/word/2012/wordml" xmlns:w16se="http://schemas.microsoft.com/office/word/2015/wordml/symex" xmlns:wpg="http://schemas.microsoft.com/office/word/2010/wordprocessingGroup" xmlns:wpi="http://schemas.microsoft.com/office/word/2010/wordprocessingInk" xmlns:wne="http://schemas.microsoft.com/office/word/2006/wordml" xmlns:wps="http://schemas.microsoft.com/office/word/2010/wordprocessingShape" mc:Ignorable="w14 w15 w16se wp14">
+<w:numbering xmlns:wpc="http://schemas.microsoft.com/office/word/2010/wordprocessingCanvas" xmlns:cx="http://schemas.microsoft.com/office/drawing/2014/chartex" xmlns:cx1="http://schemas.microsoft.com/office/drawing/2015/9/8/chartex" xmlns:cx2="http://schemas.microsoft.com/office/drawing/2015/10/21/chartex" xmlns:cx3="http://schemas.microsoft.com/office/drawing/2016/5/9/chartex" xmlns:cx4="http://schemas.microsoft.com/office/drawing/2016/5/10/chartex" xmlns:cx5="http://schemas.microsoft.com/office/drawing/2016/5/11/chartex" xmlns:cx6="http://schemas.microsoft.com/office/drawing/2016/5/12/chartex" xmlns:cx7="http://schemas.microsoft.com/office/drawing/2016/5/13/chartex" xmlns:cx8="http://schemas.microsoft.com/office/drawing/2016/5/14/chartex" xmlns:mc="http://schemas.openxmlformats.org/markup-compatibility/2006" xmlns:aink="http://schemas.microsoft.com/office/drawing/2016/ink" xmlns:am3d="http://schemas.microsoft.com/office/drawing/2017/model3d" xmlns:o="urn:schemas-microsoft-com:office:office" xmlns:oel="http://schemas.microsoft.com/office/2019/extlst" xmlns:r="http://schemas.openxmlformats.org/officeDocument/2006/relationships" xmlns:m="http://schemas.openxmlformats.org/officeDocument/2006/math" xmlns:v="urn:schemas-microsoft-com:vml" xmlns:wp14="http://schemas.microsoft.com/office/word/2010/wordprocessingDrawing" xmlns:wp="http://schemas.openxmlformats.org/drawingml/2006/wordprocessingDrawing" xmlns:w10="urn:schemas-microsoft-com:office:word" xmlns:w="http://schemas.openxmlformats.org/wordprocessingml/2006/main" xmlns:w14="http://schemas.microsoft.com/office/word/2010/wordml" xmlns:w15="http://schemas.microsoft.com/office/word/2012/wordml" xmlns:w16cex="http://schemas.microsoft.com/office/word/2018/wordml/cex" xmlns:w16cid="http://schemas.microsoft.com/office/word/2016/wordml/cid" xmlns:w16="http://schemas.microsoft.com/office/word/2018/wordml" xmlns:w16du="http://schemas.microsoft.com/office/word/2023/wordml/word16du" xmlns:w16sdtdh="http://schemas.microsoft.com/office/word/2020/wordml/sdtdatahash" xmlns:w16sdtfl="http://schemas.microsoft.com/office/word/2024/wordml/sdtformatlock" xmlns:w16se="http://schemas.microsoft.com/office/word/2015/wordml/symex" xmlns:wpg="http://schemas.microsoft.com/office/word/2010/wordprocessingGroup" xmlns:wpi="http://schemas.microsoft.com/office/word/2010/wordprocessingInk" xmlns:wne="http://schemas.microsoft.com/office/word/2006/wordml" xmlns:wps="http://schemas.microsoft.com/office/word/2010/wordprocessingShape" mc:Ignorable="w14 w15 w16se w16cid w16 w16cex w16sdtdh w16sdtfl w16du wp14">
   <w:abstractNum w:abstractNumId="0" w15:restartNumberingAfterBreak="0">
     <w:nsid w:val="FFFFFF7C"/>
     <w:multiLevelType w:val="singleLevel"/>
@@ -417,38 +363,38 @@
       </w:rPr>
     </w:lvl>
   </w:abstractNum>
-  <w:num w:numId="1">
+  <w:num w:numId="1" w16cid:durableId="344093923">
     <w:abstractNumId w:val="8"/>
   </w:num>
-  <w:num w:numId="2">
+  <w:num w:numId="2" w16cid:durableId="1835993229">
     <w:abstractNumId w:val="6"/>
   </w:num>
-  <w:num w:numId="3">
+  <w:num w:numId="3" w16cid:durableId="1087190506">
     <w:abstractNumId w:val="5"/>
   </w:num>
-  <w:num w:numId="4">
+  <w:num w:numId="4" w16cid:durableId="1149446330">
     <w:abstractNumId w:val="4"/>
   </w:num>
-  <w:num w:numId="5">
+  <w:num w:numId="5" w16cid:durableId="1619294596">
     <w:abstractNumId w:val="7"/>
   </w:num>
-  <w:num w:numId="6">
+  <w:num w:numId="6" w16cid:durableId="1876232950">
     <w:abstractNumId w:val="3"/>
   </w:num>
-  <w:num w:numId="7">
+  <w:num w:numId="7" w16cid:durableId="1135294226">
     <w:abstractNumId w:val="2"/>
   </w:num>
-  <w:num w:numId="8">
+  <w:num w:numId="8" w16cid:durableId="442312553">
     <w:abstractNumId w:val="1"/>
   </w:num>
-  <w:num w:numId="9">
+  <w:num w:numId="9" w16cid:durableId="2060929837">
     <w:abstractNumId w:val="0"/>
   </w:num>
 </w:numbering>
 </file>
 
 <file path=word/styles.xml><?xml version="1.0" encoding="utf-8"?>
-<w:styles xmlns:mc="http://schemas.openxmlformats.org/markup-compatibility/2006" xmlns:r="http://schemas.openxmlformats.org/officeDocument/2006/relationships" xmlns:w="http://schemas.openxmlformats.org/wordprocessingml/2006/main" xmlns:w14="http://schemas.microsoft.com/office/word/2010/wordml" xmlns:w15="http://schemas.microsoft.com/office/word/2012/wordml" xmlns:w16se="http://schemas.microsoft.com/office/word/2015/wordml/symex" mc:Ignorable="w14 w15 w16se">
+<w:styles xmlns:mc="http://schemas.openxmlformats.org/markup-compatibility/2006" xmlns:r="http://schemas.openxmlformats.org/officeDocument/2006/relationships" xmlns:w="http://schemas.openxmlformats.org/wordprocessingml/2006/main" xmlns:w14="http://schemas.microsoft.com/office/word/2010/wordml" xmlns:w15="http://schemas.microsoft.com/office/word/2012/wordml" xmlns:w16cex="http://schemas.microsoft.com/office/word/2018/wordml/cex" xmlns:w16cid="http://schemas.microsoft.com/office/word/2016/wordml/cid" xmlns:w16="http://schemas.microsoft.com/office/word/2018/wordml" xmlns:w16du="http://schemas.microsoft.com/office/word/2023/wordml/word16du" xmlns:w16sdtdh="http://schemas.microsoft.com/office/word/2020/wordml/sdtdatahash" xmlns:w16sdtfl="http://schemas.microsoft.com/office/word/2024/wordml/sdtformatlock" xmlns:w16se="http://schemas.microsoft.com/office/word/2015/wordml/symex" mc:Ignorable="w14 w15 w16se w16cid w16 w16cex w16sdtdh w16sdtfl w16du">
   <w:docDefaults>
     <w:rPrDefault>
       <w:rPr>
@@ -464,7 +410,7 @@
       </w:pPr>
     </w:pPrDefault>
   </w:docDefaults>
-  <w:latentStyles w:defLockedState="0" w:defUIPriority="99" w:defSemiHidden="0" w:defUnhideWhenUsed="0" w:defQFormat="0" w:count="371">
+  <w:latentStyles w:defLockedState="0" w:defUIPriority="99" w:defSemiHidden="0" w:defUnhideWhenUsed="0" w:defQFormat="0" w:count="376">
     <w:lsdException w:name="Normal" w:uiPriority="0" w:qFormat="1"/>
     <w:lsdException w:name="heading 1" w:uiPriority="9" w:qFormat="1"/>
     <w:lsdException w:name="heading 2" w:semiHidden="1" w:uiPriority="9" w:unhideWhenUsed="1" w:qFormat="1"/>
@@ -827,6 +773,11 @@
     <w:lsdException w:name="List Table 5 Dark Accent 6" w:uiPriority="50"/>
     <w:lsdException w:name="List Table 6 Colorful Accent 6" w:uiPriority="51"/>
     <w:lsdException w:name="List Table 7 Colorful Accent 6" w:uiPriority="52"/>
+    <w:lsdException w:name="Mention" w:semiHidden="1" w:unhideWhenUsed="1"/>
+    <w:lsdException w:name="Smart Hyperlink" w:semiHidden="1" w:unhideWhenUsed="1"/>
+    <w:lsdException w:name="Hashtag" w:semiHidden="1" w:unhideWhenUsed="1"/>
+    <w:lsdException w:name="Unresolved Mention" w:semiHidden="1" w:unhideWhenUsed="1"/>
+    <w:lsdException w:name="Smart Link" w:semiHidden="1" w:unhideWhenUsed="1"/>
   </w:latentStyles>
   <w:style w:type="paragraph" w:default="1" w:styleId="Normal">
     <w:name w:val="Normal"/>
@@ -1689,7 +1640,7 @@
       <w:color w:val="4F81BD" w:themeColor="accent1"/>
     </w:rPr>
   </w:style>
-  <w:style w:type="character" w:styleId="Emphaseple">
+  <w:style w:type="character" w:styleId="Accentuationlgre">
     <w:name w:val="Subtle Emphasis"/>
     <w:basedOn w:val="Policepardfaut"/>
     <w:uiPriority w:val="19"/>
@@ -1701,7 +1652,7 @@
       <w:color w:val="808080" w:themeColor="text1" w:themeTint="7F"/>
     </w:rPr>
   </w:style>
-  <w:style w:type="character" w:styleId="Emphaseintense">
+  <w:style w:type="character" w:styleId="Accentuationintense">
     <w:name w:val="Intense Emphasis"/>
     <w:basedOn w:val="Policepardfaut"/>
     <w:uiPriority w:val="21"/>
@@ -1715,7 +1666,7 @@
       <w:color w:val="4F81BD" w:themeColor="accent1"/>
     </w:rPr>
   </w:style>
-  <w:style w:type="character" w:styleId="Rfrenceple">
+  <w:style w:type="character" w:styleId="Rfrencelgre">
     <w:name w:val="Subtle Reference"/>
     <w:basedOn w:val="Policepardfaut"/>
     <w:uiPriority w:val="31"/>

</xml_diff>

<commit_message>
restore: original academic case study file
</commit_message>
<xml_diff>
--- a/docs/academic-case-study-fr.docx
+++ b/docs/academic-case-study-fr.docx
@@ -1,6 +1,6 @@
 
 <file path=word/document.xml><?xml version="1.0" encoding="utf-8"?>
-<w:document xmlns:wpc="http://schemas.microsoft.com/office/word/2010/wordprocessingCanvas" xmlns:cx="http://schemas.microsoft.com/office/drawing/2014/chartex" xmlns:cx1="http://schemas.microsoft.com/office/drawing/2015/9/8/chartex" xmlns:cx2="http://schemas.microsoft.com/office/drawing/2015/10/21/chartex" xmlns:cx3="http://schemas.microsoft.com/office/drawing/2016/5/9/chartex" xmlns:cx4="http://schemas.microsoft.com/office/drawing/2016/5/10/chartex" xmlns:cx5="http://schemas.microsoft.com/office/drawing/2016/5/11/chartex" xmlns:cx6="http://schemas.microsoft.com/office/drawing/2016/5/12/chartex" xmlns:cx7="http://schemas.microsoft.com/office/drawing/2016/5/13/chartex" xmlns:cx8="http://schemas.microsoft.com/office/drawing/2016/5/14/chartex" xmlns:mc="http://schemas.openxmlformats.org/markup-compatibility/2006" xmlns:aink="http://schemas.microsoft.com/office/drawing/2016/ink" xmlns:am3d="http://schemas.microsoft.com/office/drawing/2017/model3d" xmlns:o="urn:schemas-microsoft-com:office:office" xmlns:oel="http://schemas.microsoft.com/office/2019/extlst" xmlns:r="http://schemas.openxmlformats.org/officeDocument/2006/relationships" xmlns:m="http://schemas.openxmlformats.org/officeDocument/2006/math" xmlns:v="urn:schemas-microsoft-com:vml" xmlns:wp14="http://schemas.microsoft.com/office/word/2010/wordprocessingDrawing" xmlns:wp="http://schemas.openxmlformats.org/drawingml/2006/wordprocessingDrawing" xmlns:w10="urn:schemas-microsoft-com:office:word" xmlns:w="http://schemas.openxmlformats.org/wordprocessingml/2006/main" xmlns:w14="http://schemas.microsoft.com/office/word/2010/wordml" xmlns:w15="http://schemas.microsoft.com/office/word/2012/wordml" xmlns:w16cex="http://schemas.microsoft.com/office/word/2018/wordml/cex" xmlns:w16cid="http://schemas.microsoft.com/office/word/2016/wordml/cid" xmlns:w16="http://schemas.microsoft.com/office/word/2018/wordml" xmlns:w16du="http://schemas.microsoft.com/office/word/2023/wordml/word16du" xmlns:w16sdtdh="http://schemas.microsoft.com/office/word/2020/wordml/sdtdatahash" xmlns:w16sdtfl="http://schemas.microsoft.com/office/word/2024/wordml/sdtformatlock" xmlns:w16se="http://schemas.microsoft.com/office/word/2015/wordml/symex" xmlns:wpg="http://schemas.microsoft.com/office/word/2010/wordprocessingGroup" xmlns:wpi="http://schemas.microsoft.com/office/word/2010/wordprocessingInk" xmlns:wne="http://schemas.microsoft.com/office/word/2006/wordml" xmlns:wps="http://schemas.microsoft.com/office/word/2010/wordprocessingShape" mc:Ignorable="w14 w15 w16se w16cid w16 w16cex w16sdtdh w16sdtfl w16du wp14">
+<w:document xmlns:wpc="http://schemas.microsoft.com/office/word/2010/wordprocessingCanvas" xmlns:cx="http://schemas.microsoft.com/office/drawing/2014/chartex" xmlns:mc="http://schemas.openxmlformats.org/markup-compatibility/2006" xmlns:o="urn:schemas-microsoft-com:office:office" xmlns:r="http://schemas.openxmlformats.org/officeDocument/2006/relationships" xmlns:m="http://schemas.openxmlformats.org/officeDocument/2006/math" xmlns:v="urn:schemas-microsoft-com:vml" xmlns:wp14="http://schemas.microsoft.com/office/word/2010/wordprocessingDrawing" xmlns:wp="http://schemas.openxmlformats.org/drawingml/2006/wordprocessingDrawing" xmlns:w10="urn:schemas-microsoft-com:office:word" xmlns:w="http://schemas.openxmlformats.org/wordprocessingml/2006/main" xmlns:w14="http://schemas.microsoft.com/office/word/2010/wordml" xmlns:w15="http://schemas.microsoft.com/office/word/2012/wordml" xmlns:w16se="http://schemas.microsoft.com/office/word/2015/wordml/symex" xmlns:wpg="http://schemas.microsoft.com/office/word/2010/wordprocessingGroup" xmlns:wpi="http://schemas.microsoft.com/office/word/2010/wordprocessingInk" xmlns:wne="http://schemas.microsoft.com/office/word/2006/wordml" xmlns:wps="http://schemas.microsoft.com/office/word/2010/wordprocessingShape" mc:Ignorable="w14 w15 w16se wp14">
   <w:body>
     <w:p>
       <w:pPr>
@@ -13,7 +13,21 @@
         <w:rPr>
           <w:lang w:val="fr-FR"/>
         </w:rPr>
-        <w:t>Étude de cas – Segmentation réseau avec VLANs dans une PME</w:t>
+        <w:t xml:space="preserve">Étude de cas – Segmentation réseau avec </w:t>
+      </w:r>
+      <w:proofErr w:type="spellStart"/>
+      <w:r>
+        <w:rPr>
+          <w:lang w:val="fr-FR"/>
+        </w:rPr>
+        <w:t>VLANs</w:t>
+      </w:r>
+      <w:proofErr w:type="spellEnd"/>
+      <w:r>
+        <w:rPr>
+          <w:lang w:val="fr-FR"/>
+        </w:rPr>
+        <w:t xml:space="preserve"> dans une PME</w:t>
       </w:r>
     </w:p>
     <w:p>
@@ -74,7 +88,13 @@
           <w:lang w:val="fr-FR"/>
         </w:rPr>
         <w:br/>
-        <w:t>L'entreprise dispose de 10 postes pour le service RH, 8 pour la comptabilité, 6 pour le service informatique, et 6 pour la direction. Actuellement, tous les ordinateurs sont connectés sur un même réseau local sans aucune segmentation.</w:t>
+        <w:t xml:space="preserve">L'entreprise </w:t>
+      </w:r>
+      <w:r>
+        <w:rPr>
+          <w:lang w:val="fr-FR"/>
+        </w:rPr>
+        <w:t>dispose de 10 postes pour le service RH, 8 pour la comptabilité, 6 pour le service informatique, et 6 pour la direction. Actuellement, tous les ordinateurs sont connectés sur un même réseau local sans aucune segmentation.</w:t>
       </w:r>
     </w:p>
     <w:p>
@@ -101,7 +121,13 @@
         <w:rPr>
           <w:lang w:val="fr-FR"/>
         </w:rPr>
-        <w:t>- Trop de diffusion réseau (broadcast).</w:t>
+        <w:t>- Trop de diffusi</w:t>
+      </w:r>
+      <w:r>
+        <w:rPr>
+          <w:lang w:val="fr-FR"/>
+        </w:rPr>
+        <w:t>on réseau (broadcast).</w:t>
       </w:r>
       <w:r>
         <w:rPr>
@@ -136,7 +162,13 @@
         <w:rPr>
           <w:lang w:val="fr-FR"/>
         </w:rPr>
-        <w:t>3. Objectif du projet</w:t>
+        <w:t>3. O</w:t>
+      </w:r>
+      <w:r>
+        <w:rPr>
+          <w:lang w:val="fr-FR"/>
+        </w:rPr>
+        <w:t>bjectif du projet</w:t>
       </w:r>
     </w:p>
     <w:p>
@@ -149,7 +181,21 @@
         <w:rPr>
           <w:lang w:val="fr-FR"/>
         </w:rPr>
-        <w:t>Mettre en place une segmentation logique du réseau via des VLANs pour :</w:t>
+        <w:t xml:space="preserve">Mettre en place une segmentation logique du réseau via des </w:t>
+      </w:r>
+      <w:proofErr w:type="spellStart"/>
+      <w:r>
+        <w:rPr>
+          <w:lang w:val="fr-FR"/>
+        </w:rPr>
+        <w:t>VLANs</w:t>
+      </w:r>
+      <w:proofErr w:type="spellEnd"/>
+      <w:r>
+        <w:rPr>
+          <w:lang w:val="fr-FR"/>
+        </w:rPr>
+        <w:t xml:space="preserve"> pour :</w:t>
       </w:r>
       <w:r>
         <w:rPr>
@@ -177,8 +223,16 @@
           <w:lang w:val="fr-FR"/>
         </w:rPr>
         <w:br/>
-        <w:t>- Préparer l’infrastructure à l’évolution future (Wi-Fi, téléphonie IP).</w:t>
+        <w:t>- Préparer l’infrastructure à l’évolution future (Wi-Fi, télé</w:t>
       </w:r>
+      <w:r>
+        <w:rPr>
+          <w:lang w:val="fr-FR"/>
+        </w:rPr>
+        <w:t>phonie IP).</w:t>
+      </w:r>
+      <w:bookmarkStart w:id="0" w:name="_GoBack"/>
+      <w:bookmarkEnd w:id="0"/>
     </w:p>
     <w:sectPr>
       <w:pgSz w:w="12240" w:h="15840"/>
@@ -191,7 +245,7 @@
 </file>
 
 <file path=word/numbering.xml><?xml version="1.0" encoding="utf-8"?>
-<w:numbering xmlns:wpc="http://schemas.microsoft.com/office/word/2010/wordprocessingCanvas" xmlns:cx="http://schemas.microsoft.com/office/drawing/2014/chartex" xmlns:cx1="http://schemas.microsoft.com/office/drawing/2015/9/8/chartex" xmlns:cx2="http://schemas.microsoft.com/office/drawing/2015/10/21/chartex" xmlns:cx3="http://schemas.microsoft.com/office/drawing/2016/5/9/chartex" xmlns:cx4="http://schemas.microsoft.com/office/drawing/2016/5/10/chartex" xmlns:cx5="http://schemas.microsoft.com/office/drawing/2016/5/11/chartex" xmlns:cx6="http://schemas.microsoft.com/office/drawing/2016/5/12/chartex" xmlns:cx7="http://schemas.microsoft.com/office/drawing/2016/5/13/chartex" xmlns:cx8="http://schemas.microsoft.com/office/drawing/2016/5/14/chartex" xmlns:mc="http://schemas.openxmlformats.org/markup-compatibility/2006" xmlns:aink="http://schemas.microsoft.com/office/drawing/2016/ink" xmlns:am3d="http://schemas.microsoft.com/office/drawing/2017/model3d" xmlns:o="urn:schemas-microsoft-com:office:office" xmlns:oel="http://schemas.microsoft.com/office/2019/extlst" xmlns:r="http://schemas.openxmlformats.org/officeDocument/2006/relationships" xmlns:m="http://schemas.openxmlformats.org/officeDocument/2006/math" xmlns:v="urn:schemas-microsoft-com:vml" xmlns:wp14="http://schemas.microsoft.com/office/word/2010/wordprocessingDrawing" xmlns:wp="http://schemas.openxmlformats.org/drawingml/2006/wordprocessingDrawing" xmlns:w10="urn:schemas-microsoft-com:office:word" xmlns:w="http://schemas.openxmlformats.org/wordprocessingml/2006/main" xmlns:w14="http://schemas.microsoft.com/office/word/2010/wordml" xmlns:w15="http://schemas.microsoft.com/office/word/2012/wordml" xmlns:w16cex="http://schemas.microsoft.com/office/word/2018/wordml/cex" xmlns:w16cid="http://schemas.microsoft.com/office/word/2016/wordml/cid" xmlns:w16="http://schemas.microsoft.com/office/word/2018/wordml" xmlns:w16du="http://schemas.microsoft.com/office/word/2023/wordml/word16du" xmlns:w16sdtdh="http://schemas.microsoft.com/office/word/2020/wordml/sdtdatahash" xmlns:w16sdtfl="http://schemas.microsoft.com/office/word/2024/wordml/sdtformatlock" xmlns:w16se="http://schemas.microsoft.com/office/word/2015/wordml/symex" xmlns:wpg="http://schemas.microsoft.com/office/word/2010/wordprocessingGroup" xmlns:wpi="http://schemas.microsoft.com/office/word/2010/wordprocessingInk" xmlns:wne="http://schemas.microsoft.com/office/word/2006/wordml" xmlns:wps="http://schemas.microsoft.com/office/word/2010/wordprocessingShape" mc:Ignorable="w14 w15 w16se w16cid w16 w16cex w16sdtdh w16sdtfl w16du wp14">
+<w:numbering xmlns:wpc="http://schemas.microsoft.com/office/word/2010/wordprocessingCanvas" xmlns:cx="http://schemas.microsoft.com/office/drawing/2014/chartex" xmlns:mc="http://schemas.openxmlformats.org/markup-compatibility/2006" xmlns:o="urn:schemas-microsoft-com:office:office" xmlns:r="http://schemas.openxmlformats.org/officeDocument/2006/relationships" xmlns:m="http://schemas.openxmlformats.org/officeDocument/2006/math" xmlns:v="urn:schemas-microsoft-com:vml" xmlns:wp14="http://schemas.microsoft.com/office/word/2010/wordprocessingDrawing" xmlns:wp="http://schemas.openxmlformats.org/drawingml/2006/wordprocessingDrawing" xmlns:w10="urn:schemas-microsoft-com:office:word" xmlns:w="http://schemas.openxmlformats.org/wordprocessingml/2006/main" xmlns:w14="http://schemas.microsoft.com/office/word/2010/wordml" xmlns:w15="http://schemas.microsoft.com/office/word/2012/wordml" xmlns:w16se="http://schemas.microsoft.com/office/word/2015/wordml/symex" xmlns:wpg="http://schemas.microsoft.com/office/word/2010/wordprocessingGroup" xmlns:wpi="http://schemas.microsoft.com/office/word/2010/wordprocessingInk" xmlns:wne="http://schemas.microsoft.com/office/word/2006/wordml" xmlns:wps="http://schemas.microsoft.com/office/word/2010/wordprocessingShape" mc:Ignorable="w14 w15 w16se wp14">
   <w:abstractNum w:abstractNumId="0" w15:restartNumberingAfterBreak="0">
     <w:nsid w:val="FFFFFF7C"/>
     <w:multiLevelType w:val="singleLevel"/>
@@ -363,38 +417,38 @@
       </w:rPr>
     </w:lvl>
   </w:abstractNum>
-  <w:num w:numId="1" w16cid:durableId="344093923">
+  <w:num w:numId="1">
     <w:abstractNumId w:val="8"/>
   </w:num>
-  <w:num w:numId="2" w16cid:durableId="1835993229">
+  <w:num w:numId="2">
     <w:abstractNumId w:val="6"/>
   </w:num>
-  <w:num w:numId="3" w16cid:durableId="1087190506">
+  <w:num w:numId="3">
     <w:abstractNumId w:val="5"/>
   </w:num>
-  <w:num w:numId="4" w16cid:durableId="1149446330">
+  <w:num w:numId="4">
     <w:abstractNumId w:val="4"/>
   </w:num>
-  <w:num w:numId="5" w16cid:durableId="1619294596">
+  <w:num w:numId="5">
     <w:abstractNumId w:val="7"/>
   </w:num>
-  <w:num w:numId="6" w16cid:durableId="1876232950">
+  <w:num w:numId="6">
     <w:abstractNumId w:val="3"/>
   </w:num>
-  <w:num w:numId="7" w16cid:durableId="1135294226">
+  <w:num w:numId="7">
     <w:abstractNumId w:val="2"/>
   </w:num>
-  <w:num w:numId="8" w16cid:durableId="442312553">
+  <w:num w:numId="8">
     <w:abstractNumId w:val="1"/>
   </w:num>
-  <w:num w:numId="9" w16cid:durableId="2060929837">
+  <w:num w:numId="9">
     <w:abstractNumId w:val="0"/>
   </w:num>
 </w:numbering>
 </file>
 
 <file path=word/styles.xml><?xml version="1.0" encoding="utf-8"?>
-<w:styles xmlns:mc="http://schemas.openxmlformats.org/markup-compatibility/2006" xmlns:r="http://schemas.openxmlformats.org/officeDocument/2006/relationships" xmlns:w="http://schemas.openxmlformats.org/wordprocessingml/2006/main" xmlns:w14="http://schemas.microsoft.com/office/word/2010/wordml" xmlns:w15="http://schemas.microsoft.com/office/word/2012/wordml" xmlns:w16cex="http://schemas.microsoft.com/office/word/2018/wordml/cex" xmlns:w16cid="http://schemas.microsoft.com/office/word/2016/wordml/cid" xmlns:w16="http://schemas.microsoft.com/office/word/2018/wordml" xmlns:w16du="http://schemas.microsoft.com/office/word/2023/wordml/word16du" xmlns:w16sdtdh="http://schemas.microsoft.com/office/word/2020/wordml/sdtdatahash" xmlns:w16sdtfl="http://schemas.microsoft.com/office/word/2024/wordml/sdtformatlock" xmlns:w16se="http://schemas.microsoft.com/office/word/2015/wordml/symex" mc:Ignorable="w14 w15 w16se w16cid w16 w16cex w16sdtdh w16sdtfl w16du">
+<w:styles xmlns:mc="http://schemas.openxmlformats.org/markup-compatibility/2006" xmlns:r="http://schemas.openxmlformats.org/officeDocument/2006/relationships" xmlns:w="http://schemas.openxmlformats.org/wordprocessingml/2006/main" xmlns:w14="http://schemas.microsoft.com/office/word/2010/wordml" xmlns:w15="http://schemas.microsoft.com/office/word/2012/wordml" xmlns:w16se="http://schemas.microsoft.com/office/word/2015/wordml/symex" mc:Ignorable="w14 w15 w16se">
   <w:docDefaults>
     <w:rPrDefault>
       <w:rPr>
@@ -410,7 +464,7 @@
       </w:pPr>
     </w:pPrDefault>
   </w:docDefaults>
-  <w:latentStyles w:defLockedState="0" w:defUIPriority="99" w:defSemiHidden="0" w:defUnhideWhenUsed="0" w:defQFormat="0" w:count="376">
+  <w:latentStyles w:defLockedState="0" w:defUIPriority="99" w:defSemiHidden="0" w:defUnhideWhenUsed="0" w:defQFormat="0" w:count="371">
     <w:lsdException w:name="Normal" w:uiPriority="0" w:qFormat="1"/>
     <w:lsdException w:name="heading 1" w:uiPriority="9" w:qFormat="1"/>
     <w:lsdException w:name="heading 2" w:semiHidden="1" w:uiPriority="9" w:unhideWhenUsed="1" w:qFormat="1"/>
@@ -773,11 +827,6 @@
     <w:lsdException w:name="List Table 5 Dark Accent 6" w:uiPriority="50"/>
     <w:lsdException w:name="List Table 6 Colorful Accent 6" w:uiPriority="51"/>
     <w:lsdException w:name="List Table 7 Colorful Accent 6" w:uiPriority="52"/>
-    <w:lsdException w:name="Mention" w:semiHidden="1" w:unhideWhenUsed="1"/>
-    <w:lsdException w:name="Smart Hyperlink" w:semiHidden="1" w:unhideWhenUsed="1"/>
-    <w:lsdException w:name="Hashtag" w:semiHidden="1" w:unhideWhenUsed="1"/>
-    <w:lsdException w:name="Unresolved Mention" w:semiHidden="1" w:unhideWhenUsed="1"/>
-    <w:lsdException w:name="Smart Link" w:semiHidden="1" w:unhideWhenUsed="1"/>
   </w:latentStyles>
   <w:style w:type="paragraph" w:default="1" w:styleId="Normal">
     <w:name w:val="Normal"/>
@@ -1640,7 +1689,7 @@
       <w:color w:val="4F81BD" w:themeColor="accent1"/>
     </w:rPr>
   </w:style>
-  <w:style w:type="character" w:styleId="Accentuationlgre">
+  <w:style w:type="character" w:styleId="Emphaseple">
     <w:name w:val="Subtle Emphasis"/>
     <w:basedOn w:val="Policepardfaut"/>
     <w:uiPriority w:val="19"/>
@@ -1652,7 +1701,7 @@
       <w:color w:val="808080" w:themeColor="text1" w:themeTint="7F"/>
     </w:rPr>
   </w:style>
-  <w:style w:type="character" w:styleId="Accentuationintense">
+  <w:style w:type="character" w:styleId="Emphaseintense">
     <w:name w:val="Intense Emphasis"/>
     <w:basedOn w:val="Policepardfaut"/>
     <w:uiPriority w:val="21"/>
@@ -1666,7 +1715,7 @@
       <w:color w:val="4F81BD" w:themeColor="accent1"/>
     </w:rPr>
   </w:style>
-  <w:style w:type="character" w:styleId="Rfrencelgre">
+  <w:style w:type="character" w:styleId="Rfrenceple">
     <w:name w:val="Subtle Reference"/>
     <w:basedOn w:val="Policepardfaut"/>
     <w:uiPriority w:val="31"/>

</xml_diff>